<commit_message>
Proofcheck Inn Trouble Dutch: SIGNIFICANT (8 fixes)
Co-Authored-By: Claude Opus 5.5 <noreply@anthropic.com>
Claude-Session: https://claude.ai/code/session_012Cm8JxdqzjuttdUSdkQCUg
</commit_message>
<xml_diff>
--- a/translated/corrected/Inn Trouble - ASSEMBLED - FORMATTED_Dutch.docx
+++ b/translated/corrected/Inn Trouble - ASSEMBLED - FORMATTED_Dutch.docx
@@ -153,7 +153,7 @@
     </w:p>
     <w:p>
       <w:r>
-        <w:t>Hoofdstuk 3</w:t>
+        <w:t>Hoofdstuk 1</w:t>
       </w:r>
     </w:p>
     <w:p/>
@@ -788,7 +788,7 @@
     </w:p>
     <w:p>
       <w:r>
-        <w:t>Toen Pip en ik eindelijk uit de herberg kwamen, sneed de kou me de adem af, en ik bleef even op de stoep staan met een hand vlak gedrukt op de plek waar het briefje opgevouwen tegen mijn jas lag. Een diefstal van een eeuw oud, en nu kon een goede vrouw er haar slaap niet voor vatten. En slechts twee plekken in de wereld waar dat geheim vandaan kon zijn gekomen, waarvan eentje een doos was die alleen Fiona open kon krijgen.</w:t>
+        <w:t>Toen Pip en ik eindelijk uit de herberg kwamen, sneed de kou me de adem af, en ik bleef even op de veranda staan met een hand vlak gedrukt op de plek waar het briefje opgevouwen tegen mijn jas lag. Een diefstal van een eeuw oud, en nu kon een goede vrouw er haar slaap niet voor vatten. En slechts twee plekken in de wereld waar dat geheim vandaan kon zijn gekomen, waarvan eentje een doos was die alleen Fiona open kon krijgen.</w:t>
       </w:r>
     </w:p>
     <w:p>
@@ -1218,7 +1218,7 @@
     <w:p/>
     <w:p>
       <w:r>
-        <w:t xml:space="preserve">Theo boog zijn hoofd, verheugd, en ging verder met iedereen uit te nodigen voor de cider.</w:t>
+        <w:t xml:space="preserve">Theo boog zijn hoofd, verheugd, en ging verder met iedereen uit te nodigen voor de appelsap.</w:t>
       </w:r>
     </w:p>
     <w:p/>
@@ -1492,7 +1492,7 @@
     <w:p/>
     <w:p>
       <w:r>
-        <w:t xml:space="preserve">De brink was de plek waar het festival zou plaatsvinden, het grote gemeenschappelijke grasveld ten zuiden van Evergreen die vanaf het dorpsplein afliep, met het oorlogsmonument vlak bij het begin en de grote iep aan de overkant. Het hele dorp was uitgelopen om de boel aan te kleden. Er moesten schragen worden aangesleept en in rijen worden opgesteld, er moest aan de noordkant een podium worden gebouwd en er moesten wel duizend kleine kalebassen worden gerangschikt in een opstelling die nonchalant moest lijken. Daar zou door een commissie in werkelijkheid een uur lang over worden getwist. Ik was er alleen gekomen om het eerste dozijn wanten van de kring bij de festivalcommissie af te leveren, en binnen negentig tellen nadat ik was aangekomen, was me door een onbekende man een kist met taartpompoenen in de handen gedrukt met de mededeling: ‘Zet die even vooraan bij het podium neer, wil je? Pas op voor die zachte.’ Zo ging dat nu eenmaal in dit dorp, en dat vond ik helemaal niet erg. Met een kist pompoenen in mijn armen viel er niet na te denken, en dat kwam me goed uit.</w:t>
+        <w:t xml:space="preserve">De brink was de plek waar het festival zou plaatsvinden, het grote gemeenschappelijke grasveld ten zuiden van Evergreen dat vanaf het dorpsplein afliep, met het oorlogsmonument vlak bij het begin en de grote iep aan de overkant. Het hele dorp was uitgelopen om de boel aan te kleden. Er moesten schragen worden aangesleept en in rijen worden opgesteld, er moest aan de noordkant een podium worden gebouwd en er moesten wel duizend kleine kalebassen worden gerangschikt in een opstelling die nonchalant moest lijken. Daar zou door een commissie in werkelijkheid een uur lang over worden getwist. Ik was er alleen gekomen om het eerste dozijn wanten van de kring bij de festivalcommissie af te leveren, en binnen negentig tellen nadat ik was aangekomen, was me door een onbekende man een kist met taartpompoenen in de handen gedrukt met de mededeling: ‘Zet die even vooraan bij het podium neer, wil je? Pas op voor die zachte.’ Zo ging dat nu eenmaal in dit dorp, en dat vond ik helemaal niet erg. Met een kist pompoenen in mijn armen viel er niet na te denken, en dat kwam me goed uit.</w:t>
       </w:r>
     </w:p>
     <w:p/>
@@ -3955,7 +3955,7 @@
     <w:p/>
     <w:p>
       <w:r>
-        <w:t xml:space="preserve">Ik bleef roerloos in het lamplicht zitten. De diefstal van de broche en de aankoop van de herberg waren twee verschillende geheimen, bewaard in twee verschillende gebouwen. Theo had er één van. Hij had het archief, de brieven, de cataloguskaart, het briefpapier. Hij had de diefstal. Maar het bewijs dat gestolen geld deze geliefde herberg was geworden, lag in het stadhuis, in de vastgoeddossiers waarvan een stijve, vermoeide vrouw mij recht in de ogen had aangekeken en had gezworen dat ze die nooit las.</w:t>
+        <w:t xml:space="preserve">Ik bleef roerloos in het lamplicht zitten. De diefstal van de broche en de aankoop van de herberg waren twee verschillende geheimen, bewaard in twee verschillende gebouwen. Theo had er één van. Hij had het archief, de brieven, de cataloguskaart, het briefpapier. Hij had het geheim van de diefstal. Maar het bewijs dat gestolen geld deze geliefde herberg was geworden, lag in het stadhuis, in de vastgoeddossiers waarvan een stijve, vermoeide vrouw mij recht in de ogen had aangekeken en had gezworen dat ze die nooit las.</w:t>
       </w:r>
     </w:p>
     <w:p/>
@@ -4586,7 +4586,7 @@
     <w:p/>
     <w:p>
       <w:r>
-        <w:t xml:space="preserve">Dat had het einde moeten zijn. Maar er was nog altijd het Genootschap zelf, precies datgene wat Theo had verwoest in zijn poging het te redden. Hij was er nu niet meer bij. Het dak lekte nog steeds en de verwarmingsketel begaf het bijna, en niets in deze hele afrekening had ook maar één dollar bijgedragen aan het een of het ander.</w:t>
+        <w:t xml:space="preserve">Dat had het einde moeten zijn. Maar er was nog altijd het Genootschap zelf, precies datgene waarvoor Theo zichzelf te gronde had gericht in zijn poging het te redden. Hij was er nu niet meer bij. Het dak lekte nog steeds en de verwarmingsketel begaf het bijna, en niets in deze hele afrekening had ook maar één dollar bijgedragen aan het een of het ander.</w:t>
       </w:r>
     </w:p>
     <w:p/>
@@ -4759,7 +4759,7 @@
     <w:p/>
     <w:p>
       <w:r>
-        <w:t xml:space="preserve">Ik had me erop ingesteld de buitenstaander te worden die een goed man ten val bracht. Ik had meer dan half verwacht dat het dorp kil zou worden naar mij toe, dat ze zouden wensen dat ik me er niet mee had bemoeid, dat ze zich zouden herinneren, telkens als ze naar me keken, dat ik degene was die Theo Hussein in het licht had gesleept en de boel overhoop had gehaald. En dat was er hier en daar ook wel even, een poosje. Een paar mensen die me niet recht in de ogen konden aankijken, die wat stilletjes werden als ik een winkel binnenkwam. Ik begreep het en liet het rusten. Ik drong nergens op aan.</w:t>
+        <w:t xml:space="preserve">Ik had me erop ingesteld de buitenstaander te worden die een goed man ten val bracht. Ik had meer dan half verwacht dat het dorp kil zou worden naar mij toe, dat ze zouden wensen dat ik me er niet mee had bemoeid, dat ze zich zouden herinneren, telkens als ze naar me keken, dat ik degene was die Theo Hussein in het licht had gesleept en het dorp verdriet had gedaan. En dat was er hier en daar ook wel even, een poosje. Een paar mensen die me niet recht in de ogen konden aankijken, die wat stilletjes werden als ik een winkel binnenkwam. Ik begreep het en liet het rusten. Ik drong nergens op aan.</w:t>
       </w:r>
     </w:p>
     <w:p/>
@@ -5438,7 +5438,7 @@
     <w:p/>
     <w:p>
       <w:r>
-        <w:t>En dat was de nuchtere kijk op de zaak, en de kring nam die over, en iemand riep iets over de jeugd van tegenwoordig en een ander opperde dat het vroeger toen zij jong was nooit zo sneeuwde, en het gesprek ging weer over zoals gesprekjes in een kring nu eenmaal gaan, en Ivy pakte nog een gemberkoekje. Maar ik bleef iets langer bij het raam staan dan de rest, met mijn halfgemaakte krans nog in mijn hand. Ik keek naar die middelste sneeuwpop die naar het begin van de straat stond te staren. Ik keek naar de gladde, ongeschonden sneeuw die door geen enkele kwajongenslaars was aangeraakt. En ik zei niet wat ik dacht.</w:t>
+        <w:t>En dat was de nuchtere kijk op de zaak, en de kring nam die over, en iemand riep iets over de jeugd van tegenwoordig en een ander opperde dat het vroeger toen zij jong was nooit zo sneeuwde, en het gesprek ging weer over zoals gesprekjes in een kring nu eenmaal gaan, en Ivy pakte nog een gemberkoekje. Maar ik bleef iets langer bij het raam staan dan de rest, met mijn halfgemaakte krans nog in mijn hand. Ik keek naar die middelste sneeuwpop die de straat op stond te staren. Ik keek naar de gladde, ongeschonden sneeuw die door geen enkele kwajongenslaars was aangeraakt. En ik zei niet wat ik dacht.</w:t>
       </w:r>
     </w:p>
     <w:p/>

</xml_diff>

<commit_message>
Full proofcheck Inn Trouble Dutch: MINOR (21 edits)
Co-Authored-By: Claude Opus 5.5 <noreply@anthropic.com>
Claude-Session: https://claude.ai/code/session_012Cm8JxdqzjuttdUSdkQCUg
</commit_message>
<xml_diff>
--- a/translated/corrected/Inn Trouble - ASSEMBLED - FORMATTED_Dutch.docx
+++ b/translated/corrected/Inn Trouble - ASSEMBLED - FORMATTED_Dutch.docx
@@ -609,7 +609,7 @@
     </w:p>
     <w:p>
       <w:r>
-        <w:t xml:space="preserve">Het was een briefje. Het handschrift was opzettelijk slordig neergepend, vol onregelmatige schuine letters en afgebroken tekens, de gekunstelde onhandigheid van iemand die er hard aan werkt om zijn handschrift te verhullen. Het bedrag was het eerste wat in het oog sprong, omdat degene die het had geschreven erop had gehamerd dat dat het eerste was wat iemand zou zien. Vijfhonderdduizend dollar. En daaronder, in datzelfde moeizame krabbelschrift, de rest. </w:t>
+        <w:t xml:space="preserve">Het was een briefje. Het handschrift was opzettelijk slordig neergepend, vol onregelmatige schuine letters en afgebroken tekens, de gekunstelde onhandigheid van iemand die er hard aan werkt om het eigen handschrift te verhullen. Het bedrag was het eerste wat in het oog sprong, omdat degene die het had geschreven erop had gehamerd dat dat het eerste was wat iemand zou zien. Vijfhonderdduizend dollar. En daaronder, in datzelfde moeizame krabbelschrift, de rest. </w:t>
       </w:r>
       <w:r>
         <w:rPr>
@@ -1048,7 +1048,7 @@
     <w:p/>
     <w:p>
       <w:r>
-        <w:t xml:space="preserve">We bleven daar nog een poosje staan kijken naar het gouden stadje, en daarna gingen we naar bed. Ik lag nog een flinke tijd wakker in het donker, terwijl ik twee dingen tegelijk bezighield. Ergens beneden in Frost Falls had iemand tussen de dozen van Blackburn gestaan en een manier gevonden om zijn hand te sluiten om de keel van een goede vrouw voor een half miljoen dollar. En voorbij de weide was mijn man een verrassing aan het bouwen waar hij geen naam aan wilde geven, terwijl de lichten uit zichzelf goud kleurden en de magie die we hadden meegebracht door de duisternis joeg op zoek naar een plek om neer te strijken.</w:t>
+        <w:t xml:space="preserve">We bleven daar nog een poosje staan kijken naar het gouden stadje, en daarna gingen we naar bed. Ik lag nog een flinke tijd wakker in het donker, terwijl ik twee dingen tegelijk bezighield. Ergens beneden in Frost Falls had iemand tussen de dozen van Blackburn gestaan en een manier gevonden om een hand te sluiten om de keel van een goede vrouw voor een half miljoen dollar. En voorbij de weide was mijn man een verrassing aan het bouwen waar hij geen naam aan wilde geven, terwijl de lichten uit zichzelf goud kleurden en de magie die we hadden meegebracht door de duisternis joeg op zoek naar een plek om neer te strijken.</w:t>
       </w:r>
     </w:p>
     <w:p/>
@@ -1182,7 +1182,7 @@
     <w:p/>
     <w:p>
       <w:r>
-        <w:t xml:space="preserve">‘Ik ben altijd naar mijn broche op zoek. Dat is nu eenmaal het vak.’ Hij richtte zich op en stopte het notitieboekje onder zijn arm. ‘Er kwam net iemand bij de appelsaptafel naar me toe om te vertellen dat de Blackburns ooit de helft van Maple Street in bezit hadden. Wist u dat? Mensen vertellen je graag wat rijke families allemaal bezaten. Maar ze kunnen je nooit vertellen wat die rijke families aandeden aan de mensen die voor ze werkten. Dat deel haalt de familiepapieren blijkbaar niet.’ Hij knikte naar het glas. ‘Gek hè. Twintig jaar aan brieven en niet één geschreven door een meid.’</w:t>
+        <w:t xml:space="preserve">‘Ik ben altijd naar mijn broche op zoek. Dat is nu eenmaal het vak.’ Hij richtte zich op en stopte het notitieboekje onder zijn arm. ‘Er kwam net een man bij de appelsaptafel naar me toe om te vertellen dat de Blackburns ooit de helft van Maple Street in bezit hadden. Wist u dat? Mensen vertellen je graag wat rijke families allemaal bezaten. Maar ze kunnen je nooit vertellen wat die rijke families aandeden aan de mensen die voor ze werkten. Dat deel haalt de familiepapieren blijkbaar niet.’ Hij knikte naar het glas. ‘Gek hè. Twintig jaar aan brieven en niet één geschreven door een meid.’</w:t>
       </w:r>
     </w:p>
     <w:p/>
@@ -1582,7 +1582,7 @@
     <w:p/>
     <w:p>
       <w:r>
-        <w:t xml:space="preserve">‘Hoe gaat het met je, Mark?’ vroeg ik hem op zachte toon de volgende keer dat we elkaar passeerden, terwijl Emma een wankele vrede bezwoor tussen Snowball en een pompoen die hem had beledigd.</w:t>
+        <w:t xml:space="preserve">‘Hoe gaat het met je, Mark?’ vroeg ik hem op zachte toon de volgende keer dat we elkaar passeerden, terwijl Emma een wankele vrede bezwoor tussen Snowball en een kalebas die hem had beledigd.</w:t>
       </w:r>
     </w:p>
     <w:p/>
@@ -1869,7 +1869,7 @@
     <w:p/>
     <w:p>
       <w:r>
-        <w:t xml:space="preserve">‘U heeft de herberg gedaan,’ zei ik op losse toon terwijl ik de houder omdraaide. ‘Al dat smeedwerk in Fiona’s lobby. De sterren op de schouw, de lampenarmen, het haardscherm.’</w:t>
+        <w:t xml:space="preserve">‘U heeft de herberg gedaan,’ zei ik op losse toon terwijl ik de houder omdraaide. ‘Al dat smeedwerk in Fiona’s lobby. De sterren op de schouw, de lantaarnbeugels, het haardscherm.’</w:t>
       </w:r>
     </w:p>
     <w:p/>
@@ -1947,7 +1947,7 @@
     <w:p/>
     <w:p>
       <w:r>
-        <w:t xml:space="preserve">‘Die zijn ook van haar,’ zei hij, terwijl hij er een oppakte en in het licht hield, en zelfs nu nog sprak er liefde voor dat ding uit zijn handen. ‘De verandabeugels. Het laatste deel van de bestelling. Ik heb dit jaar heel wat van mezelf in die lobby gestopt, weet je. Je kunt niet door Fiona’s voorkamer lopen zonder iets aan te raken wat ik heb gemaakt, of er vlakbij in de buurt te zijn.’ Hij legde de ster neer. ‘Prima zo. Een smid laat een plek nu eenmaal graag achter met de geur van zijn vuur.’</w:t>
+        <w:t xml:space="preserve">‘Die zijn ook van haar,’ zei hij, terwijl hij er een oppakte en in het licht hield, en zelfs nu nog sprak er liefde voor dat ding uit zijn handen. ‘De verandabeugels. Het laatste deel van de bestelling. Ik heb dit jaar heel wat van mezelf in die lobby gestopt, weet u. Je kunt niet door Fiona’s voorkamer lopen zonder iets aan te raken wat ik heb gemaakt, of er vlakbij in de buurt te zijn.’ Hij legde de ster neer. ‘Prima zo. Een smid laat een plek nu eenmaal graag achter met de geur van zijn vuur.’</w:t>
       </w:r>
     </w:p>
     <w:p/>
@@ -1965,7 +1965,7 @@
     <w:p/>
     <w:p>
       <w:r>
-        <w:t xml:space="preserve">‘Dank u wel, Sam,’ zei ik, en betaalde hem voor de houder, en ik meende de bedankjes voor meer dan alleen de houder. ‘Voor het werk. En dat je zo oprecht naar haar hebt geïnformeerd. Ik zal het haar vertellen. Vriendelijk.’</w:t>
+        <w:t xml:space="preserve">‘Dank u wel, Sam,’ zei ik, en betaalde hem voor de houder, en ik meende de bedankjes voor meer dan alleen de houder. ‘Voor het werk. En dat u zo oprecht naar haar hebt geïnformeerd. Ik zal het haar vertellen. Vriendelijk.’</w:t>
       </w:r>
     </w:p>
     <w:p/>
@@ -2527,7 +2527,7 @@
     <w:p/>
     <w:p>
       <w:r>
-        <w:t xml:space="preserve">Het zou zoveel makkelijker zijn geweest als Theo een slecht mens was geweest, iemand op wie ik zonder wroeging kon neerkijken. Maar ik zat in die koude kamer en begreep door en door hoe Theo Hussein, die dit zag en hoorde, een map met oude brieven kon openmaken, daarin niet een honderd jaar oude misdaad zag maar een reddingsboei, en daarnaar zou grijpen, zichzelf onderweg telkens wijsmakend dat hij het voor het Genootschap deed. Ik nam het hem niet in dank af. Maar ik begreep het, en dat droeg ik koud en zwaar met me mee gedurende de rest van de vergadering.</w:t>
+        <w:t xml:space="preserve">Het zou zoveel makkelijker zijn geweest als Theo een slecht mens was geweest, iemand op wie ik zonder wroeging kon neerkijken. Maar ik zat in die koude kamer en begreep door en door hoe Theo Hussein, die dit zag en hoorde, een map met oude brieven kon openmaken, daarin niet een honderd jaar oude misdaad zag maar een reddingsboei, en daarnaar zou grijpen, zichzelf onderweg telkens wijsmakend dat hij het voor het Genootschap deed. Ik vergaf het niet. Maar ik begreep het, en dat droeg ik koud en zwaar met me mee gedurende de rest van de vergadering.</w:t>
       </w:r>
     </w:p>
     <w:p/>
@@ -3117,7 +3117,7 @@
     </w:p>
     <w:p>
       <w:r>
-        <w:t xml:space="preserve">‘Dan blijven er twee over.’ Ik keek naar de pagina en wilde dat niet. Vera. Theo. De twee namen waar ik geen streep door kon zetten. ‘En hier maak ik me zorgen over. Van iedereen op dit blad zijn de enige twee die ik niet kan vrijpleiten degenen die de sleutels van de oude papieren van het dorp in handen hebben. Vera bewaart de akten en de eigendomsregisters, een eeuw aan wie-bezat-wat, de akte van de herberg zit daar ergens tussen. Ze werd stijf als een plank en vertelde me dat ze de papieren die vlak achter haar rug staan nooit leest. En Theo.’ Ik dwong mezelf om het langzaam te zeggen. ‘Theo woont in het archief. De brieven van Blackburn waren in zijn hoede, in zijn handen. En de meest interessante daarvan, precies degenen die zouden vertellen dat er een broche was verdwenen en waar die is gebleven, zijn degenen waarvan hij voor het hele dorp opstond om aan te kondigen dat ze zoekgeraakt waren.’</w:t>
+        <w:t xml:space="preserve">‘Dan blijven er twee over.’ Ik keek naar de pagina en wilde dat niet. Vera. Theo. De twee namen waar ik geen streep door kon zetten. ‘En hier maak ik me zorgen over. Van iedereen op dit blad zijn de enige twee die ik niet kan vrijpleiten degenen die de sleutels van de oude papieren van het dorp in handen hebben. Vera bewaart de akten en de vastgoedregisters, een eeuw aan wie-bezat-wat, de akte van de herberg zit daar ergens tussen. Ze werd stijf als een plank en vertelde me dat ze de papieren die vlak achter haar rug staan nooit leest. En Theo.’ Ik dwong mezelf om het langzaam te zeggen. ‘Theo woont in het archief. De brieven van Blackburn waren in zijn hoede, in zijn handen. En de meest interessante daarvan, precies degenen die zouden vertellen dat er een broche was verdwenen en waar die is gebleven, zijn degenen waarvan hij voor het hele dorp opstond om aan te kondigen dat ze zoekgeraakt waren.’</w:t>
       </w:r>
     </w:p>
     <w:p>
@@ -3174,7 +3174,7 @@
     <w:p/>
     <w:p>
       <w:r>
-        <w:t>Hij was niet in de smederij. Hij stond bij de herberg op een ladder tegen de veranda de laatste ijzeren steunen op te hangen, met een mond vol schroeven en een waterpas op de leuning. Toen hij me over het tuinpad zag aankomen, kwam hij behoedzaam naar beneden. De laatste keer dat we hadden gepraat, was ik om hem heen gedraaid zonder het hardop te zeggen, en dat had hij gevoeld, ook al had hij er geen vinger op kunnen leggen.</w:t>
+        <w:t>Hij was niet in de smederij. Hij stond bij de herberg op een ladder tegen de veranda de laatste ijzeren beugels op te hangen, met een mond vol schroeven en een waterpas op de leuning. Toen hij me over het tuinpad zag aankomen, kwam hij behoedzaam naar beneden. De laatste keer dat we hadden gepraat, was ik om hem heen gedraaid zonder het hardop te zeggen, en dat had hij gevoeld, ook al had hij er geen vinger op kunnen leggen.</w:t>
       </w:r>
     </w:p>
     <w:p/>
@@ -3234,7 +3234,7 @@
     <w:p/>
     <w:p>
       <w:r>
-        <w:t>De geur op het briefje was nooit die van Sam geweest. Het was het gevolg van zijn werk. Een smid werkt ijzer af door er olie in te branden terwijl het nog heet is, en nieuw ijzerwerk behoudt die rookgeur wekenlang. Fiona’s receptie hing er vol mee, de trapleuning, het haardscherm, de steunen die op de veranda werden gehangen, en Sams jas en gereedschapstas hadden al drie weken elke dag bij haar deur gehangen. Elk papiertje dat op dat bureau lag, nam die geur op. Het briefje had er ook gelegen. De aanwijzing die hem bovenaan mijn lijstje had gezet, had me al die tijd verteld waar het briefje was geweest. Niet wie het had geschreven. Ik had het van de verkeerde kant gelezen. Nu kon ik het op de goede manier lezen, en zo bezien waste het hem helemaal schoon.</w:t>
+        <w:t>De geur op het briefje was nooit die van Sam geweest. Het was het gevolg van zijn werk. Een smid werkt ijzer af door er olie in te branden terwijl het nog heet is, en nieuw ijzerwerk behoudt die rookgeur wekenlang. Fiona’s lobby hing er vol mee, de trapleuning, het haardscherm, de beugels die op de veranda werden gehangen, en Sams jas en gereedschapstas hadden al drie weken elke dag bij haar deur gehangen. Elk papiertje dat op dat bureau lag, nam die geur op. Het briefje had er ook gelegen. De aanwijzing die hem bovenaan mijn lijstje had gezet, had me al die tijd verteld waar het briefje was geweest. Niet wie het had geschreven. Ik had het van de verkeerde kant gelezen. Nu kon ik het op de goede manier lezen, en zo bezien waste het hem helemaal schoon.</w:t>
       </w:r>
     </w:p>
     <w:p/>
@@ -3252,7 +3252,7 @@
     <w:p/>
     <w:p>
       <w:r>
-        <w:t>Ik beloofde dat ik het zou doen, alle beide, en liet hem weer achter bij zijn steunen. Pip deed met enige tegenzin afstand van de schroeven, waarna zij en ik weer over de heldere, koude straat terugliepen. Ergens tussen de herberg en de hoek streepte ik Sam Patel in gedachten door van de lijst, en dat gaf me een goed gevoel. Nog een naam weggestreept. Nog een goede man die, zodra ik hem binnenliet, veranderde van een scheur in de muur rondom Fiona in een nieuwe steen ervan.</w:t>
+        <w:t>Ik beloofde dat ik het zou doen, alle beide, en liet hem weer achter bij zijn beugels. Pip deed met enige tegenzin afstand van de schroeven, waarna zij en ik weer over de heldere, koude straat terugliepen. Ergens tussen de herberg en de hoek streepte ik Sam Patel in gedachten door van de lijst, en dat gaf me een goed gevoel. Nog een naam weggestreept. Nog een goede man die, zodra ik hem binnenliet, veranderde van een scheur in de muur rondom Fiona in een nieuwe steen ervan.</w:t>
       </w:r>
     </w:p>
     <w:p/>
@@ -3311,7 +3311,7 @@
     </w:p>
     <w:p>
       <w:r>
-        <w:t xml:space="preserve">‘Een half miljoen.’ Hij leunde achterover en slaakte een zacht gefluit. ‘Lieve hemel. Iemand is die afstammeling aan het uitknijpen. Over iets waar de wet niet bij kan.’ Hij schudde langzaam zijn hoofd, en daar sprak walging uit, echte walging. ‘Dat is wreed, mevrouw Claus, en het is stom. Er is niemand die nu nog ergens aangifte van zou kunnen doen vanwege die broche. De nalatenschap van de Blackburns hoeft het geld van uw vriendin niet en ze hoeven haar huid al helemaal niet. Ze willen één regel in een grootboek waar staat waar dat sieraad is gebleven, zodat de advocaten het dossier kunnen sluiten en elkaar niet langer rekeningen hoeven te sturen. Wie uw vriendin ook aan het leegbloeden is, die verkoopt haar een angst die niet eens echt is. De schande is het enige wapen dat daarin zit. Er is geen juridische zaak meer over, echt niet na honderd jaar.’</w:t>
+        <w:t xml:space="preserve">‘Een half miljoen.’ Hij leunde achterover en slaakte een zacht gefluit. ‘Lieve hemel. Iemand is die afstammeling aan het uitknijpen. Over iets waar de wet niet bij kan.’ Hij schudde langzaam zijn hoofd, en daar sprak walging uit, echte walging. ‘Dat is wreed, mevrouw Claus, en het is stom. Er is niemand die nu nog ergens aangifte van zou kunnen doen vanwege die broche. De nalatenschap van de Blackburns hoeft het geld van uw vriendin niet en ze hoeven haar huid al helemaal niet. Ze willen één regel in een grootboek waar staat waar dat sieraad is gebleven, zodat de advocaten het dossier kunnen sluiten en elkaar niet langer rekeningen hoeven te sturen. Wie uw vriendin ook aan het uitzuigen is, die verkoopt haar een angst die niet eens echt is. De schande is het enige wapen dat daarin zit. Er is geen juridische zaak meer over, echt niet na honderd jaar.’</w:t>
       </w:r>
     </w:p>
     <w:p/>
@@ -3418,7 +3418,7 @@
         <w:rPr>
           <w:i/>
         </w:rPr>
-        <w:t xml:space="preserve">Correspondentie, Adelaide Blackburn aan haar zuster, winter 1924. Betreffende: de diefstal van de familiebroche (de saffier in haar hart) door een huisbediende; het stuk later verpand bij Ridgeline. Van aanzienlijk lokaal belang.</w:t>
+        <w:t xml:space="preserve">Correspondentie, Adelaide Blackburn aan haar zuster, winter 1924. Betreffende: de diefstal van de familiebroche (de saffier in haar hart) door een huisbediende; het stuk later verpand in Ridgeline. Van aanzienlijk lokaal belang.</w:t>
       </w:r>
     </w:p>
     <w:p/>
@@ -3789,7 +3789,7 @@
     </w:p>
     <w:p>
       <w:r>
-        <w:t xml:space="preserve">‘U deed net alsof u mevrouw Pelletier wilde tackelen,’ zei ze.</w:t>
+        <w:t xml:space="preserve">‘U zag eruit alsof u mevrouw Pelletier wilde tackelen,’ zei ze.</w:t>
       </w:r>
     </w:p>
     <w:p>
@@ -4449,7 +4449,7 @@
     <w:p/>
     <w:p>
       <w:r>
-        <w:t xml:space="preserve">‘Vera,’ zei ik. ‘Theo wist van de diefstal. Maar de briefjes wisten dat de herberg was gekocht met het geld van de broche, en dat heeft nooit in een Blackburn-brief gestaan. Dat is een eigendomsregister. Een akte. En de akte van deze herberg lag gisterochtend buiten haar la in uw opbergmand, aangeraakt, op het bureau van een vrouw die me twee keer had verteld dat ze nooit de dossiers achter zich leest.’ Ik hield mijn stem zacht. ‘Hij had het geheim van de diefstal. U had de akte. En u had de benen, Vera. Hij had dit stadje niet onopgemerkt kunnen doorkruisen om zijn leven te redden, iedereen kent Theo, iedereen houdt hem staande. Maar niemand kijkt op als de secretaresse van de burgemeester tijdens het festival even langskomt bij de herberg. Ik kwam u die ochtend zelf op de trappen tegen, met uw parkeerkaarten. Hij had dit niet in zijn eentje gekund. Hij had iemand nodig die zich onopgemerkt door het stadje kon bewegen. Dat was u.’</w:t>
+        <w:t xml:space="preserve">‘Vera,’ zei ik. ‘Theo wist van de diefstal. Maar de briefjes wisten dat de herberg was gekocht met het geld van de broche, en dat heeft nooit in een Blackburn-brief gestaan. Dat is een vastgoeddossier. Een akte. En de akte van deze herberg lag gisterochtend buiten haar la in uw opbergmand, aangeraakt, op het bureau van een vrouw die me twee keer had verteld dat ze nooit de dossiers achter zich leest.’ Ik hield mijn stem zacht. ‘Hij had het geheim van de diefstal. U had de akte. En u had de benen, Vera. Hij had dit stadje niet onopgemerkt kunnen doorkruisen om zijn leven te redden, iedereen kent Theo, iedereen houdt hem staande. Maar niemand kijkt op als de secretaresse van de burgemeester tijdens het festival even langskomt bij de herberg. Ik kwam u die ochtend zelf op de trappen tegen, met uw parkeerkaarten. Hij had dit niet in zijn eentje gekund. Hij had iemand nodig die zich onopgemerkt door het stadje kon bewegen. Dat was u.’</w:t>
       </w:r>
     </w:p>
     <w:p/>
@@ -4467,7 +4467,7 @@
     <w:p/>
     <w:p>
       <w:r>
-        <w:t xml:space="preserve">De kamer werd stil daarna, op het gehuil en de verre geluiden van het festival dat daarbuiten werd opgeruimd na. Twee mensen die iets wreeds hadden gedaan om redenen die ze in mooie woorden hadden gehuld tot ze niet meer konden zien wat eronder zat, zaten nu te midden van de wrakstukken, namen er eindelijk de verantwoordelijkheid voor, hardop. Er was geen val dichtgeklapt. Niemand had naar hen gegrepen vanuit de duisternis. We hadden het open en bloot uitgestald in een warme kamer in het middaglicht en hun de kans gegeven om eerlijk te zijn. Ze hadden die gegrepen, omdat de meeste mensen, precies zoals Noriko al zei, het grondig beu zijn om het met zich mee te dragen.</w:t>
+        <w:t xml:space="preserve">De kamer werd stil daarna, op het gehuil en de verre geluiden van het festival dat daarbuiten werd opgeruimd na. Twee mensen die iets wreeds hadden gedaan om redenen die ze in mooie woorden hadden gehuld tot ze niet meer konden zien wat eronder zat, zaten nu te midden van de wrakstukken, namen er eindelijk de verantwoordelijkheid voor, hardop. Er was geen val dichtgeklapt. Niemand had vanuit de duisternis een hand uitgestoken. We hadden het open en bloot uitgestald in een warme kamer in het middaglicht en hun de kans gegeven om eerlijk te zijn. Ze hadden die gegrepen, omdat de meeste mensen, precies zoals Noriko al zei, het grondig beu zijn om het met zich mee te dragen.</w:t>
       </w:r>
     </w:p>
     <w:p/>
@@ -4532,7 +4532,7 @@
     <w:p/>
     <w:p>
       <w:r>
-        <w:t xml:space="preserve">Hij trad af. Niet voor even, om later stilletjes weer op zijn stoel gezet te worden zodra de woede van het stadje was bekoeld. Hij legde zijn functie als voorzitter van het Historisch Genootschap van Frost Falls neer, en het bestuur nam dat ontslag, nu alles bekend was, volledig serieus. Je kon als man geen buurman proberen af te persen met behulp van de collectie en het briefpapier van het Genootschap, om vervolgens de sleutels van de tent te behouden.</w:t>
+        <w:t xml:space="preserve">Hij trad af. Niet voor even, om later stilletjes weer op zijn stoel gezet te worden zodra de woede van het stadje was bekoeld. Hij legde zijn functie als voorzitter van het Historisch Genootschap van Frost Falls neer, en het bestuur nam dat ontslag, nu alles bekend was, volledig serieus. Een man kon geen buurvrouw proberen af te persen met behulp van de collectie en het briefpapier van het Genootschap, om vervolgens de sleutels van de tent te behouden.</w:t>
       </w:r>
     </w:p>
     <w:p/>
@@ -4568,7 +4568,7 @@
     <w:p/>
     <w:p>
       <w:r>
-        <w:t xml:space="preserve">‘U hebt iets verkeerds gedaan,’ zei ik. ‘En u boet daar nu voor, op de juiste manier, en dat is terecht. Maar u hebt het direct bekend zodra ernaar werd gevraagd, Vera. U hebt niet gelogen en u hebt zich er niet onderuit gewurmd. Dat is niet niks. Dat is het stuk in u dat nog steeds goed is, en dat is groter dan het stuk dat de fout beging, en ik wil dat u dat vasthoudt. De weg terug is lang voor u. Maar hij is er wel. Laat niemand u wijsmaken dat het niet zo is, en praat het vooral uzelf ook niet aan.’</w:t>
+        <w:t xml:space="preserve">‘U hebt iets verkeerds gedaan,’ zei ik. ‘En u boet daar nu voor, op de juiste manier, en dat is terecht. Maar u hebt het direct bekend zodra ernaar werd gevraagd, Vera. U hebt niet gelogen en u hebt zich er niet onderuit gewurmd. Dat is niet niks. Dat is het stuk in u dat nog steeds goed is, en dat is groter dan het stuk dat de fout beging, en ik wil dat u dat vasthoudt. De weg terug is ook voor u lang. Maar hij is er wel. Laat niemand u wijsmaken dat het niet zo is, en praat het vooral uzelf ook niet aan.’</w:t>
       </w:r>
     </w:p>
     <w:p/>
@@ -5414,7 +5414,7 @@
     <w:p/>
     <w:p>
       <w:r>
-        <w:t xml:space="preserve">‘Iemands stomme grap,’ concludeerde Dot. ‘’s Nachts omgedraaid. Kinderen.’</w:t>
+        <w:t xml:space="preserve">‘Iemands grapje,’ concludeerde Dot. ‘’s Nachts omgedraaid. Kinderen.’</w:t>
       </w:r>
     </w:p>
     <w:p/>

</xml_diff>